<commit_message>
Complete remaining theme features
</commit_message>
<xml_diff>
--- a/IC2/flutter_application_1/submission/IC02_Critical_Thinking.docx
+++ b/IC2/flutter_application_1/submission/IC02_Critical_Thinking.docx
@@ -95,7 +95,7 @@
           <w:sz w:val="22"/>
           <w:u w:val="none"/>
         </w:rPr>
-        <w:t>If the same color were written separately in the avatar, badge, app bar, icon, and text, changing the design would mean finding and editing all five places. Missing one could also make the text hard to see in dark mode. Here the colors are defined in ThemeData, and the widgets read colorScheme.primary, secondary, onPrimary, or onSecondary. Theme.of(context) finds the nearest Theme above that widget through Flutter's inherited-widget system. Widgets using that theme are updated when it changes. Thats why the badge can reads secondary in both modes and get amber or teal from the same line of code.</w:t>
+        <w:t>If the same color were written separately in the avatar, badge, app bar, icon, and text, changing the design would mean finding and editing all five places. Missing one could also make the text hard to see in dark mode. Here the colors are defined in ThemeData, and the widgets read colorScheme.primary, secondary, onPrimary, or onSecondary. The status icon also reads the success color from the AppColors theme extension. Theme.of(context) finds the nearest Theme above that widget through Flutter's inherited-widget system. Widgets using that theme are updated when it changes. Thats why the badge can reads secondary in both modes and get amber or teal from the same line of code.</w:t>
       </w:r>
     </w:p>
     <w:p>
@@ -159,7 +159,7 @@
           <w:sz w:val="22"/>
           <w:u w:val="none"/>
         </w:rPr>
-        <w:t>The AnimatedContainer in this app changes the badge decoration over 400 milliseconds. Animating one container limits the extra animation work to a small part of the screen, but other themed widgets may not change at exactly the same pace. An AnimatedTheme changes the theme data for all the widgets below it that use the theme. That makes the colors feel more consistent, but more dependent widgets may rebuild and repaint during the transition. For a production app with many themed widgets, Id use one app-wide theme transition and check that it stays smooth. MaterialApp already animates theme changes by default, so Id avoid adding a second AnimatedTheme around the same content without a reason.</w:t>
+        <w:t>The AnimatedContainer in this app changes the badge decoration over 400 milliseconds. Animating one container limits the extra animation work to a small part of the screen, but other themed widgets may not change at exactly the same pace. An AnimatedTheme changes the theme data for all the widgets below it that use the theme. That makes the colors feel more consistent, but more dependent widgets may rebuild and repaint during the transition. For a production app with many themed widgets, Id use one app-wide theme transition and check that it stays smooth. This app now uses an AnimatedTheme in MaterialApp.builder with a 500 millisecond duration. The default MaterialApp animation is set to zero so the explicit AnimatedTheme controls the screen transition. The custom success color changes smoothly too because AppColors defines lerp.</w:t>
       </w:r>
     </w:p>
     <w:sectPr>

</xml_diff>